<commit_message>
feat: tambah field program_studi, perbaiki frontend (overflow, palet, required toggle)
</commit_message>
<xml_diff>
--- a/app/templates/template_spm_generate.docx
+++ b/app/templates/template_spm_generate.docx
@@ -354,7 +354,7 @@
         <w:rPr>
           <w:spacing w:val="-5"/>
         </w:rPr>
-        <w:t>Yth</w:t>
+        <w:t>Yth.</w:t>
       </w:r>
     </w:p>
     <w:p>
@@ -507,17 +507,15 @@
       </w:r>
       <w:r>
         <w:rPr/>
-        <w:t>Program Studi S1</w:t>
-      </w:r>
-      <w:r>
-        <w:rPr>
-          <w:spacing w:val="-3"/>
-        </w:rPr>
-        <w:t xml:space="preserve"> </w:t>
+        <w:t xml:space="preserve">Program Studi </w:t>
       </w:r>
       <w:r>
         <w:rPr/>
-        <w:t>Farmasi Universitas Muhammadiyah Banjarmasin Semester {{ semester }} Tahun Akademik {{ tahun_akademik }} yang Insyaa Allah akan</w:t>
+        <w:t>{{ program_studi }}</w:t>
+      </w:r>
+      <w:r>
+        <w:rPr/>
+        <w:t xml:space="preserve"> Universitas Muhammadiyah Banjarmasin Semester {{ semester }} Tahun Akademik {{ tahun_akademik }} yang Insyaa Allah akan</w:t>
       </w:r>
       <w:r>
         <w:rPr>
@@ -1315,7 +1313,7 @@
   <w:p>
     <w:pPr>
       <w:pStyle w:val="BodyText"/>
-      <w:spacing w:lineRule="auto" w:line="9"/>
+      <w:spacing w:lineRule="auto" w:line="7"/>
       <w:rPr>
         <w:sz w:val="20"/>
       </w:rPr>
@@ -1352,9 +1350,9 @@
                         <a:avLst/>
                         <a:gdLst>
                           <a:gd name="textAreaLeft" fmla="*/ 0 w 3308760"/>
-                          <a:gd name="textAreaRight" fmla="*/ 3310560 w 3308760"/>
+                          <a:gd name="textAreaRight" fmla="*/ 3310920 w 3308760"/>
                           <a:gd name="textAreaTop" fmla="*/ 0 h 720"/>
-                          <a:gd name="textAreaBottom" fmla="*/ 4680 h 720"/>
+                          <a:gd name="textAreaBottom" fmla="*/ 6840 h 720"/>
                         </a:gdLst>
                         <a:ahLst/>
                         <a:rect l="textAreaLeft" t="textAreaTop" r="textAreaRight" b="textAreaBottom"/>
@@ -2269,7 +2267,7 @@
   <w:p>
     <w:pPr>
       <w:pStyle w:val="BodyText"/>
-      <w:spacing w:lineRule="auto" w:line="9"/>
+      <w:spacing w:lineRule="auto" w:line="7"/>
       <w:rPr>
         <w:sz w:val="20"/>
       </w:rPr>
@@ -2306,9 +2304,9 @@
                         <a:avLst/>
                         <a:gdLst>
                           <a:gd name="textAreaLeft" fmla="*/ 0 w 3308760"/>
-                          <a:gd name="textAreaRight" fmla="*/ 3310560 w 3308760"/>
+                          <a:gd name="textAreaRight" fmla="*/ 3310920 w 3308760"/>
                           <a:gd name="textAreaTop" fmla="*/ 0 h 720"/>
-                          <a:gd name="textAreaBottom" fmla="*/ 4680 h 720"/>
+                          <a:gd name="textAreaBottom" fmla="*/ 6840 h 720"/>
                         </a:gdLst>
                         <a:ahLst/>
                         <a:rect l="textAreaLeft" t="textAreaTop" r="textAreaRight" b="textAreaBottom"/>
@@ -3325,9 +3323,9 @@
                         <a:avLst/>
                         <a:gdLst>
                           <a:gd name="textAreaLeft" fmla="*/ 0 w 360"/>
-                          <a:gd name="textAreaRight" fmla="*/ 5760 w 360"/>
+                          <a:gd name="textAreaRight" fmla="*/ 11520 w 360"/>
                           <a:gd name="textAreaTop" fmla="*/ 0 h 389880"/>
-                          <a:gd name="textAreaBottom" fmla="*/ 391320 h 389880"/>
+                          <a:gd name="textAreaBottom" fmla="*/ 391680 h 389880"/>
                         </a:gdLst>
                         <a:ahLst/>
                         <a:rect l="textAreaLeft" t="textAreaTop" r="textAreaRight" b="textAreaBottom"/>
@@ -3410,7 +3408,7 @@
                         <w:p>
                           <w:pPr>
                             <w:pStyle w:val="FrameContents"/>
-                            <w:overflowPunct w:val="true"/>
+                            <w:overflowPunct w:val="false"/>
                             <w:jc w:val="right"/>
                             <w:rPr/>
                           </w:pPr>
@@ -3430,7 +3428,7 @@
                         <w:p>
                           <w:pPr>
                             <w:pStyle w:val="FrameContents"/>
-                            <w:overflowPunct w:val="true"/>
+                            <w:overflowPunct w:val="false"/>
                             <w:jc w:val="right"/>
                             <w:rPr/>
                           </w:pPr>
@@ -3468,7 +3466,7 @@
                   <w:p>
                     <w:pPr>
                       <w:pStyle w:val="FrameContents"/>
-                      <w:overflowPunct w:val="true"/>
+                      <w:overflowPunct w:val="false"/>
                       <w:jc w:val="right"/>
                       <w:rPr/>
                     </w:pPr>
@@ -3488,7 +3486,7 @@
                   <w:p>
                     <w:pPr>
                       <w:pStyle w:val="FrameContents"/>
-                      <w:overflowPunct w:val="true"/>
+                      <w:overflowPunct w:val="false"/>
                       <w:jc w:val="right"/>
                       <w:rPr/>
                     </w:pPr>
@@ -3610,9 +3608,9 @@
                         <a:avLst/>
                         <a:gdLst>
                           <a:gd name="textAreaLeft" fmla="*/ 0 w 360"/>
-                          <a:gd name="textAreaRight" fmla="*/ 5760 w 360"/>
+                          <a:gd name="textAreaRight" fmla="*/ 11520 w 360"/>
                           <a:gd name="textAreaTop" fmla="*/ 0 h 389880"/>
-                          <a:gd name="textAreaBottom" fmla="*/ 391320 h 389880"/>
+                          <a:gd name="textAreaBottom" fmla="*/ 391680 h 389880"/>
                         </a:gdLst>
                         <a:ahLst/>
                         <a:rect l="textAreaLeft" t="textAreaTop" r="textAreaRight" b="textAreaBottom"/>
@@ -3695,7 +3693,7 @@
                         <w:p>
                           <w:pPr>
                             <w:pStyle w:val="FrameContents"/>
-                            <w:overflowPunct w:val="true"/>
+                            <w:overflowPunct w:val="false"/>
                             <w:jc w:val="right"/>
                             <w:rPr/>
                           </w:pPr>
@@ -3715,7 +3713,7 @@
                         <w:p>
                           <w:pPr>
                             <w:pStyle w:val="FrameContents"/>
-                            <w:overflowPunct w:val="true"/>
+                            <w:overflowPunct w:val="false"/>
                             <w:jc w:val="right"/>
                             <w:rPr/>
                           </w:pPr>
@@ -3753,7 +3751,7 @@
                   <w:p>
                     <w:pPr>
                       <w:pStyle w:val="FrameContents"/>
-                      <w:overflowPunct w:val="true"/>
+                      <w:overflowPunct w:val="false"/>
                       <w:jc w:val="right"/>
                       <w:rPr/>
                     </w:pPr>
@@ -3773,7 +3771,7 @@
                   <w:p>
                     <w:pPr>
                       <w:pStyle w:val="FrameContents"/>
-                      <w:overflowPunct w:val="true"/>
+                      <w:overflowPunct w:val="false"/>
                       <w:jc w:val="right"/>
                       <w:rPr/>
                     </w:pPr>

</xml_diff>

<commit_message>
feat: update template_spm_generate.docx with new design changes
</commit_message>
<xml_diff>
--- a/app/templates/template_spm_generate.docx
+++ b/app/templates/template_spm_generate.docx
@@ -201,7 +201,21 @@
                 <w:sz w:val="24"/>
                 <w:szCs w:val="24"/>
               </w:rPr>
-              <w:t>{{ jumlah_lampiran }}</w:t>
+              <w:t>{{ jumlah_lampiran</w:t>
+            </w:r>
+            <w:r>
+              <w:rPr>
+                <w:sz w:val="24"/>
+                <w:szCs w:val="24"/>
+              </w:rPr>
+              <w:t>_display</w:t>
+            </w:r>
+            <w:r>
+              <w:rPr>
+                <w:sz w:val="24"/>
+                <w:szCs w:val="24"/>
+              </w:rPr>
+              <w:t xml:space="preserve"> }}</w:t>
             </w:r>
           </w:p>
         </w:tc>
@@ -507,15 +521,7 @@
       </w:r>
       <w:r>
         <w:rPr/>
-        <w:t xml:space="preserve">Program Studi </w:t>
-      </w:r>
-      <w:r>
-        <w:rPr/>
-        <w:t>{{ program_studi }}</w:t>
-      </w:r>
-      <w:r>
-        <w:rPr/>
-        <w:t xml:space="preserve"> Universitas Muhammadiyah Banjarmasin Semester {{ semester }} Tahun Akademik {{ tahun_akademik }} yang Insyaa Allah akan</w:t>
+        <w:t>Program Studi {{ program_studi }} Universitas Muhammadiyah Banjarmasin Semester {{ semester }} Tahun Akademik {{ tahun_akademik }} yang Insyaa Allah akan</w:t>
       </w:r>
       <w:r>
         <w:rPr>
@@ -1313,7 +1319,7 @@
   <w:p>
     <w:pPr>
       <w:pStyle w:val="BodyText"/>
-      <w:spacing w:lineRule="auto" w:line="7"/>
+      <w:spacing w:lineRule="auto" w:line="4"/>
       <w:rPr>
         <w:sz w:val="20"/>
       </w:rPr>
@@ -1350,9 +1356,9 @@
                         <a:avLst/>
                         <a:gdLst>
                           <a:gd name="textAreaLeft" fmla="*/ 0 w 3308760"/>
-                          <a:gd name="textAreaRight" fmla="*/ 3310920 w 3308760"/>
+                          <a:gd name="textAreaRight" fmla="*/ 3311280 w 3308760"/>
                           <a:gd name="textAreaTop" fmla="*/ 0 h 720"/>
-                          <a:gd name="textAreaBottom" fmla="*/ 6840 h 720"/>
+                          <a:gd name="textAreaBottom" fmla="*/ 10080 h 720"/>
                         </a:gdLst>
                         <a:ahLst/>
                         <a:rect l="textAreaLeft" t="textAreaTop" r="textAreaRight" b="textAreaBottom"/>
@@ -2267,7 +2273,7 @@
   <w:p>
     <w:pPr>
       <w:pStyle w:val="BodyText"/>
-      <w:spacing w:lineRule="auto" w:line="7"/>
+      <w:spacing w:lineRule="auto" w:line="4"/>
       <w:rPr>
         <w:sz w:val="20"/>
       </w:rPr>
@@ -2304,9 +2310,9 @@
                         <a:avLst/>
                         <a:gdLst>
                           <a:gd name="textAreaLeft" fmla="*/ 0 w 3308760"/>
-                          <a:gd name="textAreaRight" fmla="*/ 3310920 w 3308760"/>
+                          <a:gd name="textAreaRight" fmla="*/ 3311280 w 3308760"/>
                           <a:gd name="textAreaTop" fmla="*/ 0 h 720"/>
-                          <a:gd name="textAreaBottom" fmla="*/ 6840 h 720"/>
+                          <a:gd name="textAreaBottom" fmla="*/ 10080 h 720"/>
                         </a:gdLst>
                         <a:ahLst/>
                         <a:rect l="textAreaLeft" t="textAreaTop" r="textAreaRight" b="textAreaBottom"/>
@@ -3323,9 +3329,9 @@
                         <a:avLst/>
                         <a:gdLst>
                           <a:gd name="textAreaLeft" fmla="*/ 0 w 360"/>
-                          <a:gd name="textAreaRight" fmla="*/ 11520 w 360"/>
+                          <a:gd name="textAreaRight" fmla="*/ 23040 w 360"/>
                           <a:gd name="textAreaTop" fmla="*/ 0 h 389880"/>
-                          <a:gd name="textAreaBottom" fmla="*/ 391680 h 389880"/>
+                          <a:gd name="textAreaBottom" fmla="*/ 392040 h 389880"/>
                         </a:gdLst>
                         <a:ahLst/>
                         <a:rect l="textAreaLeft" t="textAreaTop" r="textAreaRight" b="textAreaBottom"/>
@@ -3408,7 +3414,7 @@
                         <w:p>
                           <w:pPr>
                             <w:pStyle w:val="FrameContents"/>
-                            <w:overflowPunct w:val="false"/>
+                            <w:overflowPunct w:val="true"/>
                             <w:jc w:val="right"/>
                             <w:rPr/>
                           </w:pPr>
@@ -3428,7 +3434,7 @@
                         <w:p>
                           <w:pPr>
                             <w:pStyle w:val="FrameContents"/>
-                            <w:overflowPunct w:val="false"/>
+                            <w:overflowPunct w:val="true"/>
                             <w:jc w:val="right"/>
                             <w:rPr/>
                           </w:pPr>
@@ -3466,7 +3472,7 @@
                   <w:p>
                     <w:pPr>
                       <w:pStyle w:val="FrameContents"/>
-                      <w:overflowPunct w:val="false"/>
+                      <w:overflowPunct w:val="true"/>
                       <w:jc w:val="right"/>
                       <w:rPr/>
                     </w:pPr>
@@ -3486,7 +3492,7 @@
                   <w:p>
                     <w:pPr>
                       <w:pStyle w:val="FrameContents"/>
-                      <w:overflowPunct w:val="false"/>
+                      <w:overflowPunct w:val="true"/>
                       <w:jc w:val="right"/>
                       <w:rPr/>
                     </w:pPr>
@@ -3608,9 +3614,9 @@
                         <a:avLst/>
                         <a:gdLst>
                           <a:gd name="textAreaLeft" fmla="*/ 0 w 360"/>
-                          <a:gd name="textAreaRight" fmla="*/ 11520 w 360"/>
+                          <a:gd name="textAreaRight" fmla="*/ 23040 w 360"/>
                           <a:gd name="textAreaTop" fmla="*/ 0 h 389880"/>
-                          <a:gd name="textAreaBottom" fmla="*/ 391680 h 389880"/>
+                          <a:gd name="textAreaBottom" fmla="*/ 392040 h 389880"/>
                         </a:gdLst>
                         <a:ahLst/>
                         <a:rect l="textAreaLeft" t="textAreaTop" r="textAreaRight" b="textAreaBottom"/>
@@ -3693,7 +3699,7 @@
                         <w:p>
                           <w:pPr>
                             <w:pStyle w:val="FrameContents"/>
-                            <w:overflowPunct w:val="false"/>
+                            <w:overflowPunct w:val="true"/>
                             <w:jc w:val="right"/>
                             <w:rPr/>
                           </w:pPr>
@@ -3713,7 +3719,7 @@
                         <w:p>
                           <w:pPr>
                             <w:pStyle w:val="FrameContents"/>
-                            <w:overflowPunct w:val="false"/>
+                            <w:overflowPunct w:val="true"/>
                             <w:jc w:val="right"/>
                             <w:rPr/>
                           </w:pPr>
@@ -3751,7 +3757,7 @@
                   <w:p>
                     <w:pPr>
                       <w:pStyle w:val="FrameContents"/>
-                      <w:overflowPunct w:val="false"/>
+                      <w:overflowPunct w:val="true"/>
                       <w:jc w:val="right"/>
                       <w:rPr/>
                     </w:pPr>
@@ -3771,7 +3777,7 @@
                   <w:p>
                     <w:pPr>
                       <w:pStyle w:val="FrameContents"/>
-                      <w:overflowPunct w:val="false"/>
+                      <w:overflowPunct w:val="true"/>
                       <w:jc w:val="right"/>
                       <w:rPr/>
                     </w:pPr>

</xml_diff>